<commit_message>
Make Blueprint Path the clear AI Day flow
Co-authored-by: Copilot <223556219+Copilot@users.noreply.github.com>
</commit_message>
<xml_diff>
--- a/ai-day-malvern-6-26/assets/ai-day-malvern-6-26-participant-form.docx
+++ b/ai-day-malvern-6-26/assets/ai-day-malvern-6-26-participant-form.docx
@@ -48,7 +48,7 @@
           <w:sz w:val="22"/>
           <w:szCs w:val="22"/>
         </w:rPr>
-        <w:t xml:space="preserve">Use this form during the session. Fill out one agent pilot from Phase 1 through Phase 3, then transfer the answers into the live canvas if needed.</w:t>
+        <w:t xml:space="preserve">Use this form during the session. Everyone follows the Blueprint Path: fill out Phase 1, then Phase 2, then Phase 3. Transfer the answers into the live canvas if needed.</w:t>
       </w:r>
     </w:p>
     <w:p>
@@ -406,7 +406,7 @@
                 <w:sz w:val="21"/>
                 <w:szCs w:val="21"/>
               </w:rPr>
-              <w:t xml:space="preserve">Path selected: Build Path or Blueprint Path</w:t>
+              <w:t xml:space="preserve">Today's path: Blueprint Path</w:t>
             </w:r>
           </w:p>
         </w:tc>

</xml_diff>